<commit_message>
chore: sync 2026-05-07 02:30:20 UTC
</commit_message>
<xml_diff>
--- a/resumes/SaaS_resume.docx
+++ b/resumes/SaaS_resume.docx
@@ -435,13 +435,7 @@
         <w:rPr>
           <w:rFonts w:ascii="Aptos Display" w:hAnsi="Aptos Display"/>
         </w:rPr>
-        <w:t>01/</w:t>
-      </w:r>
-      <w:r>
-        <w:rPr>
-          <w:rFonts w:ascii="Aptos Display" w:hAnsi="Aptos Display"/>
-        </w:rPr>
-        <w:t>2026</w:t>
+        <w:t>current</w:t>
       </w:r>
     </w:p>
     <w:p>

</xml_diff>